<commit_message>
Revisione Pattern: Decoretor, aggiunta dettagli documentazione
</commit_message>
<xml_diff>
--- a/designPattern/decorator/Documentazione Decorator.docx
+++ b/designPattern/decorator/Documentazione Decorator.docx
@@ -19,16 +19,7 @@
     </w:p>
     <w:p>
       <w:r>
-        <w:t xml:space="preserve">Il pattern Decorator è un pattern strutturale che permette di aggiungere funzionalità a un oggetto in modo dinamico, senza modificare la sua classe </w:t>
-      </w:r>
-      <w:r>
-        <w:t>originale.</w:t>
-      </w:r>
-      <w:r>
-        <w:t xml:space="preserve"> L'idea centrale è avvolgere un oggetto base dentro uno o più decorator che implementano la stessa interfaccia del componente </w:t>
-      </w:r>
-      <w:r>
-        <w:t>iniziale.</w:t>
+        <w:t>Il pattern Decorator è un pattern strutturale che permette di aggiungere funzionalità a un oggetto in modo dinamico, senza modificare la sua classe originale. L'idea centrale è avvolgere un oggetto base dentro uno o più decorator che implementano la stessa interfaccia del componente iniziale.</w:t>
       </w:r>
     </w:p>
     <w:p>
@@ -57,10 +48,147 @@
         <w:t>​</w:t>
       </w:r>
       <w:r>
-        <w:t xml:space="preserve">. In questo modo il comportamento finale non è fisso, ma viene costruito combinando oggetti tra </w:t>
-      </w:r>
-      <w:r>
-        <w:t>loro.</w:t>
+        <w:t>. In questo modo il comportamento finale non è fisso, ma viene costruito combinando oggetti tra loro.</w:t>
+      </w:r>
+    </w:p>
+    <w:p>
+      <w:pPr>
+        <w:rPr>
+          <w:b/>
+          <w:bCs/>
+        </w:rPr>
+      </w:pPr>
+      <w:r>
+        <w:rPr>
+          <w:b/>
+          <w:bCs/>
+        </w:rPr>
+        <w:t>Attori del pattern:</w:t>
+      </w:r>
+    </w:p>
+    <w:p>
+      <w:pPr>
+        <w:pStyle w:val="Paragrafoelenco"/>
+        <w:numPr>
+          <w:ilvl w:val="0"/>
+          <w:numId w:val="2"/>
+        </w:numPr>
+        <w:rPr>
+          <w:b/>
+          <w:bCs/>
+        </w:rPr>
+      </w:pPr>
+      <w:r>
+        <w:rPr>
+          <w:b/>
+          <w:bCs/>
+        </w:rPr>
+        <w:t>ServiceIF</w:t>
+      </w:r>
+      <w:r>
+        <w:rPr>
+          <w:b/>
+          <w:bCs/>
+        </w:rPr>
+        <w:t xml:space="preserve">: </w:t>
+      </w:r>
+      <w:r>
+        <w:t>Solitamente questa è un’interfaccia che descrive il componente da creare</w:t>
+      </w:r>
+      <w:r>
+        <w:t xml:space="preserve"> a cui verranno aggiunte le funzionalità.</w:t>
+      </w:r>
+    </w:p>
+    <w:p>
+      <w:pPr>
+        <w:pStyle w:val="Paragrafoelenco"/>
+        <w:numPr>
+          <w:ilvl w:val="0"/>
+          <w:numId w:val="2"/>
+        </w:numPr>
+        <w:rPr>
+          <w:b/>
+          <w:bCs/>
+        </w:rPr>
+      </w:pPr>
+      <w:r>
+        <w:rPr>
+          <w:b/>
+          <w:bCs/>
+        </w:rPr>
+        <w:t>C</w:t>
+      </w:r>
+      <w:r>
+        <w:rPr>
+          <w:b/>
+          <w:bCs/>
+        </w:rPr>
+        <w:t>oncreteServiceX</w:t>
+      </w:r>
+      <w:r>
+        <w:rPr>
+          <w:b/>
+          <w:bCs/>
+        </w:rPr>
+        <w:t xml:space="preserve">: </w:t>
+      </w:r>
+      <w:r>
+        <w:t>È l’implementazione dell’interfaccia, quindi il componente finale</w:t>
+      </w:r>
+      <w:r>
+        <w:t xml:space="preserve"> che potrà avere altre responsabilità oltre a quelle dell’interfaccia precedente</w:t>
+      </w:r>
+    </w:p>
+    <w:p>
+      <w:pPr>
+        <w:pStyle w:val="Paragrafoelenco"/>
+        <w:numPr>
+          <w:ilvl w:val="0"/>
+          <w:numId w:val="2"/>
+        </w:numPr>
+        <w:rPr>
+          <w:b/>
+          <w:bCs/>
+        </w:rPr>
+      </w:pPr>
+      <w:r>
+        <w:rPr>
+          <w:b/>
+          <w:bCs/>
+        </w:rPr>
+        <w:t xml:space="preserve">Decoretor: </w:t>
+      </w:r>
+      <w:r>
+        <w:t>È un’interfaccia base a cui tutti i decorator devono aderire per poter aggiungere funzionalità all’oggetto concreto</w:t>
+      </w:r>
+      <w:r>
+        <w:t>, esso deve implementare ServiceIF</w:t>
+      </w:r>
+      <w:r>
+        <w:t>.</w:t>
+      </w:r>
+    </w:p>
+    <w:p>
+      <w:pPr>
+        <w:pStyle w:val="Paragrafoelenco"/>
+        <w:numPr>
+          <w:ilvl w:val="0"/>
+          <w:numId w:val="2"/>
+        </w:numPr>
+        <w:rPr>
+          <w:b/>
+          <w:bCs/>
+        </w:rPr>
+      </w:pPr>
+      <w:r>
+        <w:rPr>
+          <w:b/>
+          <w:bCs/>
+        </w:rPr>
+        <w:t xml:space="preserve">Decoretor Concreto: </w:t>
+      </w:r>
+      <w:r>
+        <w:t>È colui che aggiunge funzionalità all’oggetto passato</w:t>
       </w:r>
     </w:p>
     <w:p>
@@ -89,6 +217,7 @@
         <w:rPr>
           <w:b/>
           <w:bCs/>
+          <w:noProof/>
         </w:rPr>
         <w:drawing>
           <wp:inline distT="0" distB="0" distL="0" distR="0" wp14:anchorId="76B67309" wp14:editId="58ED3EB8">
@@ -106,7 +235,7 @@
                     <pic:cNvPicPr/>
                   </pic:nvPicPr>
                   <pic:blipFill>
-                    <a:blip r:embed="rId5"/>
+                    <a:blip r:embed="rId7"/>
                     <a:stretch>
                       <a:fillRect/>
                     </a:stretch>
@@ -129,36 +258,27 @@
     </w:p>
     <w:p>
       <w:r>
-        <w:t>L'interfaccia Bevanda definisce due metodi: </w:t>
-      </w:r>
-      <w:proofErr w:type="gramStart"/>
-      <w:r>
-        <w:t>descrizione(</w:t>
-      </w:r>
-      <w:proofErr w:type="gramEnd"/>
-      <w:r>
-        <w:t>) e </w:t>
-      </w:r>
-      <w:proofErr w:type="gramStart"/>
-      <w:r>
-        <w:t>costo(</w:t>
-      </w:r>
-      <w:proofErr w:type="gramEnd"/>
-      <w:r>
-        <w:t>) </w:t>
-      </w:r>
-      <w:r>
-        <w:rPr>
-          <w:rFonts w:ascii="Arial" w:hAnsi="Arial" w:cs="Arial"/>
-        </w:rPr>
-        <w:t>​</w:t>
-      </w:r>
-      <w:r>
-        <w:t>. </w:t>
-      </w:r>
-    </w:p>
-    <w:p>
-      <w:r>
+        <w:t>L'interfaccia Bevanda definisce due metodi: descrizione() e costo().</w:t>
+      </w:r>
+      <w:r>
+        <w:t xml:space="preserve"> Essa è il </w:t>
+      </w:r>
+      <w:r>
+        <w:rPr>
+          <w:b/>
+          <w:bCs/>
+        </w:rPr>
+        <w:t>ServiceIF</w:t>
+      </w:r>
+      <w:r>
+        <w:t> </w:t>
+      </w:r>
+    </w:p>
+    <w:p>
+      <w:r>
+        <w:rPr>
+          <w:noProof/>
+        </w:rPr>
         <w:drawing>
           <wp:inline distT="0" distB="0" distL="0" distR="0" wp14:anchorId="2EE88318" wp14:editId="6DA8D9CB">
             <wp:extent cx="6120130" cy="1362075"/>
@@ -175,7 +295,7 @@
                     <pic:cNvPicPr/>
                   </pic:nvPicPr>
                   <pic:blipFill>
-                    <a:blip r:embed="rId6"/>
+                    <a:blip r:embed="rId8"/>
                     <a:stretch>
                       <a:fillRect/>
                     </a:stretch>
@@ -198,11 +318,30 @@
     </w:p>
     <w:p>
       <w:r>
-        <w:t xml:space="preserve">La classe Caffe è il componente concreto di base, </w:t>
-      </w:r>
-    </w:p>
-    <w:p>
-      <w:r>
+        <w:t xml:space="preserve">La classe Caffe è il </w:t>
+      </w:r>
+      <w:r>
+        <w:rPr>
+          <w:b/>
+          <w:bCs/>
+        </w:rPr>
+        <w:t xml:space="preserve">ConcreteService </w:t>
+      </w:r>
+      <w:r>
+        <w:t>di base</w:t>
+      </w:r>
+      <w:r>
+        <w:t>.</w:t>
+      </w:r>
+      <w:r>
+        <w:t xml:space="preserve"> </w:t>
+      </w:r>
+    </w:p>
+    <w:p>
+      <w:r>
+        <w:rPr>
+          <w:noProof/>
+        </w:rPr>
         <w:drawing>
           <wp:inline distT="0" distB="0" distL="0" distR="0" wp14:anchorId="25ACDDAE" wp14:editId="6B275009">
             <wp:extent cx="6120130" cy="935990"/>
@@ -219,7 +358,7 @@
                     <pic:cNvPicPr/>
                   </pic:nvPicPr>
                   <pic:blipFill>
-                    <a:blip r:embed="rId7"/>
+                    <a:blip r:embed="rId9"/>
                     <a:stretch>
                       <a:fillRect/>
                     </a:stretch>
@@ -242,27 +381,37 @@
     </w:p>
     <w:p>
       <w:r>
-        <w:t>mentre </w:t>
-      </w:r>
-      <w:proofErr w:type="spellStart"/>
-      <w:proofErr w:type="gramStart"/>
-      <w:r>
-        <w:t>DecoratorBevanda</w:t>
-      </w:r>
-      <w:proofErr w:type="spellEnd"/>
-      <w:proofErr w:type="gramEnd"/>
-      <w:r>
-        <w:t> contiene un riferimento a un oggetto Bevanda e serve come base per i decorator concreti come Latte e </w:t>
-      </w:r>
-      <w:r>
-        <w:t>Zucchero.</w:t>
-      </w:r>
-    </w:p>
-    <w:p>
-      <w:r>
+        <w:t>mentre DecoratorBevanda contiene un riferimento a un oggetto Bevanda e serve come base per i decorator concreti come Latte e Zucchero.</w:t>
+      </w:r>
+      <w:r>
+        <w:t xml:space="preserve"> È quindi il </w:t>
+      </w:r>
+      <w:r>
+        <w:rPr>
+          <w:b/>
+          <w:bCs/>
+        </w:rPr>
+        <w:t>Decorator</w:t>
+      </w:r>
+      <w:r>
+        <w:t>.</w:t>
+      </w:r>
+    </w:p>
+    <w:p>
+      <w:pPr>
+        <w:rPr>
+          <w:b/>
+          <w:bCs/>
+        </w:rPr>
+      </w:pPr>
+      <w:r>
+        <w:rPr>
+          <w:noProof/>
+        </w:rPr>
+        <w:lastRenderedPageBreak/>
         <w:drawing>
-          <wp:inline distT="0" distB="0" distL="0" distR="0" wp14:anchorId="7514251E" wp14:editId="02A1BC39">
-            <wp:extent cx="6120130" cy="2094865"/>
+          <wp:inline distT="0" distB="0" distL="0" distR="0" wp14:anchorId="7514251E" wp14:editId="7E9DF327">
+            <wp:extent cx="6502400" cy="2094865"/>
             <wp:effectExtent l="0" t="0" r="0" b="635"/>
             <wp:docPr id="784991603" name="Immagine 1"/>
             <wp:cNvGraphicFramePr>
@@ -276,7 +425,7 @@
                     <pic:cNvPicPr/>
                   </pic:nvPicPr>
                   <pic:blipFill>
-                    <a:blip r:embed="rId8"/>
+                    <a:blip r:embed="rId10"/>
                     <a:stretch>
                       <a:fillRect/>
                     </a:stretch>
@@ -284,7 +433,7 @@
                   <pic:spPr>
                     <a:xfrm>
                       <a:off x="0" y="0"/>
-                      <a:ext cx="6120130" cy="2094865"/>
+                      <a:ext cx="6502400" cy="2094865"/>
                     </a:xfrm>
                     <a:prstGeom prst="rect">
                       <a:avLst/>
@@ -296,6 +445,16 @@
           </wp:inline>
         </w:drawing>
       </w:r>
+      <w:r>
+        <w:t xml:space="preserve">Entrambe queste classi sono </w:t>
+      </w:r>
+      <w:r>
+        <w:rPr>
+          <w:b/>
+          <w:bCs/>
+        </w:rPr>
+        <w:t>decorator concreti.</w:t>
+      </w:r>
     </w:p>
     <w:p>
       <w:pPr>
@@ -309,12 +468,12 @@
         <w:rPr>
           <w:b/>
           <w:bCs/>
-        </w:rPr>
-        <w:lastRenderedPageBreak/>
+          <w:noProof/>
+        </w:rPr>
         <w:drawing>
-          <wp:inline distT="0" distB="0" distL="0" distR="0" wp14:anchorId="59504E89" wp14:editId="52C1F283">
-            <wp:extent cx="6120130" cy="2056130"/>
-            <wp:effectExtent l="0" t="0" r="0" b="1270"/>
+          <wp:inline distT="0" distB="0" distL="0" distR="0" wp14:anchorId="59504E89" wp14:editId="65BED422">
+            <wp:extent cx="6568440" cy="2056130"/>
+            <wp:effectExtent l="0" t="0" r="3810" b="1270"/>
             <wp:docPr id="494697657" name="Immagine 1"/>
             <wp:cNvGraphicFramePr>
               <a:graphicFrameLocks xmlns:a="http://schemas.openxmlformats.org/drawingml/2006/main" noChangeAspect="1"/>
@@ -327,7 +486,7 @@
                     <pic:cNvPicPr/>
                   </pic:nvPicPr>
                   <pic:blipFill>
-                    <a:blip r:embed="rId9"/>
+                    <a:blip r:embed="rId11"/>
                     <a:stretch>
                       <a:fillRect/>
                     </a:stretch>
@@ -335,7 +494,7 @@
                   <pic:spPr>
                     <a:xfrm>
                       <a:off x="0" y="0"/>
-                      <a:ext cx="6120130" cy="2056130"/>
+                      <a:ext cx="6568440" cy="2056130"/>
                     </a:xfrm>
                     <a:prstGeom prst="rect">
                       <a:avLst/>
@@ -374,6 +533,7 @@
         <w:rPr>
           <w:b/>
           <w:bCs/>
+          <w:noProof/>
         </w:rPr>
         <w:drawing>
           <wp:inline distT="0" distB="0" distL="0" distR="0" wp14:anchorId="0A0ACECE" wp14:editId="5BAC6490">
@@ -391,7 +551,7 @@
                     <pic:cNvPicPr/>
                   </pic:nvPicPr>
                   <pic:blipFill>
-                    <a:blip r:embed="rId10"/>
+                    <a:blip r:embed="rId12"/>
                     <a:stretch>
                       <a:fillRect/>
                     </a:stretch>
@@ -414,15 +574,7 @@
     </w:p>
     <w:p>
       <w:r>
-        <w:t xml:space="preserve">Quando si crea new </w:t>
-      </w:r>
-      <w:proofErr w:type="gramStart"/>
-      <w:r>
-        <w:t>Caffe(</w:t>
-      </w:r>
-      <w:proofErr w:type="gramEnd"/>
-      <w:r>
-        <w:t>), si ottiene la bevanda base con descrizione e costo iniziali </w:t>
+        <w:t>Quando si crea new Caffe(), si ottiene la bevanda base con descrizione e costo iniziali </w:t>
       </w:r>
       <w:r>
         <w:rPr>
@@ -431,40 +583,30 @@
         <w:t>​</w:t>
       </w:r>
       <w:r>
-        <w:t xml:space="preserve">. Quando si crea new </w:t>
-      </w:r>
-      <w:proofErr w:type="gramStart"/>
-      <w:r>
-        <w:t>Latte(</w:t>
-      </w:r>
-      <w:proofErr w:type="gramEnd"/>
-      <w:r>
-        <w:t xml:space="preserve">new </w:t>
-      </w:r>
-      <w:proofErr w:type="gramStart"/>
-      <w:r>
-        <w:t>Caffe(</w:t>
-      </w:r>
-      <w:proofErr w:type="gramEnd"/>
-      <w:r>
-        <w:t xml:space="preserve">)), il decorator Latte richiama la bevanda interna e aggiunge la propria parte al risultato; lo stesso vale per Zucchero, che può decorare un altro decorator o direttamente il componente </w:t>
-      </w:r>
-      <w:r>
-        <w:t>base.</w:t>
-      </w:r>
-    </w:p>
-    <w:p>
-      <w:pPr>
-        <w:rPr>
-          <w:b/>
-          <w:bCs/>
-        </w:rPr>
-      </w:pPr>
-      <w:r>
-        <w:rPr>
-          <w:b/>
-          <w:bCs/>
-        </w:rPr>
+        <w:t>. Quando si crea new Latte(new Caffe()), il decorator Latte richiama la bevanda interna e aggiunge la propria parte al risultato; lo stesso vale per Zucchero, che può decorare un altro decorator o direttamente il componente base.</w:t>
+      </w:r>
+      <w:r>
+        <w:t xml:space="preserve"> Può decorare un altro decorator perché il decoretor concreto estende l’interefaccia comune che è di tipo Bevanda, il passaggio dell’oggetto concreto X da decorare è quindi interno ad ognuno di essi tramite le chiamate a super.</w:t>
+      </w:r>
+    </w:p>
+    <w:p>
+      <w:r>
+        <w:br w:type="page"/>
+      </w:r>
+    </w:p>
+    <w:p>
+      <w:pPr>
+        <w:rPr>
+          <w:b/>
+          <w:bCs/>
+        </w:rPr>
+      </w:pPr>
+      <w:r>
+        <w:rPr>
+          <w:b/>
+          <w:bCs/>
+        </w:rPr>
+        <w:lastRenderedPageBreak/>
         <w:t>Esempio di utilizzo</w:t>
       </w:r>
     </w:p>
@@ -479,6 +621,7 @@
         <w:rPr>
           <w:b/>
           <w:bCs/>
+          <w:noProof/>
         </w:rPr>
         <w:drawing>
           <wp:inline distT="0" distB="0" distL="0" distR="0" wp14:anchorId="6956B28B" wp14:editId="3E0C5FD4">
@@ -496,7 +639,7 @@
                     <pic:cNvPicPr/>
                   </pic:nvPicPr>
                   <pic:blipFill>
-                    <a:blip r:embed="rId11"/>
+                    <a:blip r:embed="rId13"/>
                     <a:stretch>
                       <a:fillRect/>
                     </a:stretch>
@@ -519,37 +662,7 @@
     </w:p>
     <w:p>
       <w:r>
-        <w:t xml:space="preserve">Un oggetto come new </w:t>
-      </w:r>
-      <w:proofErr w:type="gramStart"/>
-      <w:r>
-        <w:t>Zucchero(</w:t>
-      </w:r>
-      <w:proofErr w:type="gramEnd"/>
-      <w:r>
-        <w:t xml:space="preserve">new </w:t>
-      </w:r>
-      <w:proofErr w:type="gramStart"/>
-      <w:r>
-        <w:t>Latte(</w:t>
-      </w:r>
-      <w:proofErr w:type="gramEnd"/>
-      <w:r>
-        <w:t xml:space="preserve">new </w:t>
-      </w:r>
-      <w:proofErr w:type="gramStart"/>
-      <w:r>
-        <w:t>Caffe(</w:t>
-      </w:r>
-      <w:proofErr w:type="gramEnd"/>
-      <w:r>
-        <w:t xml:space="preserve">))) rappresenta un caffè con latte e </w:t>
-      </w:r>
-      <w:r>
-        <w:t>zucchero.</w:t>
-      </w:r>
-      <w:r>
-        <w:t> Il risultato finale nasce dalla somma progressiva dei comportamenti: il caffè fornisce la base, il latte aggiunge testo e costo, e lo zucchero aggiunge un ulteriore completamento </w:t>
+        <w:t>Un oggetto come new Zucchero(new Latte(new Caffe())) rappresenta un caffè con latte e zucchero. Il risultato finale nasce dalla somma progressiva dei comportamenti: il caffè fornisce la base, il latte aggiunge testo e costo, e lo zucchero aggiunge un ulteriore completamento </w:t>
       </w:r>
       <w:r>
         <w:rPr>
@@ -604,10 +717,7 @@
         </w:numPr>
       </w:pPr>
       <w:r>
-        <w:t>Caffè</w:t>
-      </w:r>
-      <w:r>
-        <w:t>: componente concreto di partenza </w:t>
+        <w:t>Caffè: componente concreto di partenza </w:t>
       </w:r>
       <w:r>
         <w:rPr>
@@ -626,13 +736,8 @@
           <w:numId w:val="1"/>
         </w:numPr>
       </w:pPr>
-      <w:proofErr w:type="spellStart"/>
-      <w:r>
-        <w:t>DecoratoreBevanda</w:t>
-      </w:r>
-      <w:proofErr w:type="spellEnd"/>
-      <w:r>
-        <w:t>: decorator astratto che contiene una bevanda </w:t>
+      <w:r>
+        <w:t>DecoratoreBevanda: decorator astratto che contiene una bevanda </w:t>
       </w:r>
       <w:r>
         <w:rPr>
@@ -696,22 +801,48 @@
           <w:b/>
           <w:bCs/>
         </w:rPr>
-        <w:lastRenderedPageBreak/>
         <w:t>Vantaggio principale</w:t>
       </w:r>
     </w:p>
     <w:p>
       <w:r>
-        <w:t xml:space="preserve">Il vantaggio principale del pattern Decorator è che consente di estendere il comportamento degli oggetti senza creare molte sottoclassi e senza cambiare il codice della classe </w:t>
-      </w:r>
-      <w:r>
-        <w:t>base.</w:t>
-      </w:r>
-      <w:r>
-        <w:t xml:space="preserve"> Questo rende il progetto più flessibile e più facile da estendere quando si vogliono aggiungere nuove </w:t>
-      </w:r>
-      <w:r>
-        <w:t>decorazioni.</w:t>
+        <w:t>Il vantaggio principale del pattern Decorator è che consente di estendere il comportamento degli oggetti senza creare molte sottoclassi e senza cambiare il codice della classe base. Questo rende il progetto più flessibile e più facile da estendere quando si vogliono aggiungere nuove decorazioni.</w:t>
+      </w:r>
+    </w:p>
+    <w:p>
+      <w:r>
+        <w:t>La potenza di questo pattern sta nella creazione di oggetti composti, esso infatti non usa l’ereditarietà per creare oggetti con funzionalità aggiuntive</w:t>
+      </w:r>
+      <w:r>
+        <w:t>, è quindi più flessibile rispetto ad essa poiché per aggiungere o togliere funzionalità mi basta introdurre/rimuovere decoretor concreti</w:t>
+      </w:r>
+      <w:r>
+        <w:t>.</w:t>
+      </w:r>
+    </w:p>
+    <w:p>
+      <w:pPr>
+        <w:rPr>
+          <w:b/>
+          <w:bCs/>
+        </w:rPr>
+      </w:pPr>
+      <w:r>
+        <w:rPr>
+          <w:b/>
+          <w:bCs/>
+        </w:rPr>
+        <w:t>Svantaggi</w:t>
+      </w:r>
+    </w:p>
+    <w:p>
+      <w:r>
+        <w:t>Occorre porre attenzione a come si compongono i decoratori, non devono esserci dipendenze circolari tra di essi.</w:t>
+      </w:r>
+    </w:p>
+    <w:p>
+      <w:r>
+        <w:t>Il decoratore e l’oggetto decorato non sono identici, possiamo usare il decoratore come comportamento dell’oggetto ma non dell’identità. Nell’esempio aggiungiamo latte e zucchero che sono dei decoretor e si comportano allo stesso modo dell’oggetto, danno il nome e il prezzo ma non sono la stessa cosa, essi infatti non hanno gli stessi dati dell’oggetto passato e differiscono strutturalmente da esso.</w:t>
       </w:r>
     </w:p>
     <w:p>
@@ -730,7 +861,7 @@
           <w:sz w:val="32"/>
           <w:szCs w:val="32"/>
         </w:rPr>
-        <w:t>Struttura:</w:t>
+        <w:br w:type="page"/>
       </w:r>
     </w:p>
     <w:p>
@@ -746,6 +877,27 @@
         <w:rPr>
           <w:b/>
           <w:bCs/>
+          <w:sz w:val="32"/>
+          <w:szCs w:val="32"/>
+        </w:rPr>
+        <w:lastRenderedPageBreak/>
+        <w:t>Struttura:</w:t>
+      </w:r>
+    </w:p>
+    <w:p>
+      <w:pPr>
+        <w:rPr>
+          <w:b/>
+          <w:bCs/>
+          <w:sz w:val="32"/>
+          <w:szCs w:val="32"/>
+        </w:rPr>
+      </w:pPr>
+      <w:r>
+        <w:rPr>
+          <w:b/>
+          <w:bCs/>
+          <w:noProof/>
           <w:sz w:val="32"/>
           <w:szCs w:val="32"/>
         </w:rPr>
@@ -765,7 +917,7 @@
                     <pic:cNvPicPr/>
                   </pic:nvPicPr>
                   <pic:blipFill>
-                    <a:blip r:embed="rId12"/>
+                    <a:blip r:embed="rId14"/>
                     <a:stretch>
                       <a:fillRect/>
                     </a:stretch>
@@ -786,7 +938,19 @@
         </w:drawing>
       </w:r>
     </w:p>
-    <w:p/>
+    <w:p>
+      <w:r>
+        <w:t>L’interfaccia bevanda stipula un contratto da seguire per creare un oggetto che soddisfa le prescrizioni per la decorazione, caffè è un esempio.</w:t>
+      </w:r>
+    </w:p>
+    <w:p>
+      <w:r>
+        <w:t xml:space="preserve">DecoretorBevanda è </w:t>
+      </w:r>
+      <w:r>
+        <w:t>un’aggregazione di oggetti da decorare oltre ad essere una linea guida per l’implementazione di ogni nuovo decoretor concreto che aggiungerà funzionalità all’oggetto passato</w:t>
+      </w:r>
+    </w:p>
     <w:sectPr>
       <w:pgSz w:w="11906" w:h="16838"/>
       <w:pgMar w:top="720" w:right="720" w:bottom="720" w:left="720" w:header="708" w:footer="708" w:gutter="0"/>
@@ -795,6 +959,56 @@
     </w:sectPr>
   </w:body>
 </w:document>
+</file>
+
+<file path=word/endnotes.xml><?xml version="1.0" encoding="utf-8"?>
+<w:endnotes xmlns:wpc="http://schemas.microsoft.com/office/word/2010/wordprocessingCanvas" xmlns:cx="http://schemas.microsoft.com/office/drawing/2014/chartex" xmlns:cx1="http://schemas.microsoft.com/office/drawing/2015/9/8/chartex" xmlns:cx2="http://schemas.microsoft.com/office/drawing/2015/10/21/chartex" xmlns:cx3="http://schemas.microsoft.com/office/drawing/2016/5/9/chartex" xmlns:cx4="http://schemas.microsoft.com/office/drawing/2016/5/10/chartex" xmlns:cx5="http://schemas.microsoft.com/office/drawing/2016/5/11/chartex" xmlns:cx6="http://schemas.microsoft.com/office/drawing/2016/5/12/chartex" xmlns:cx7="http://schemas.microsoft.com/office/drawing/2016/5/13/chartex" xmlns:cx8="http://schemas.microsoft.com/office/drawing/2016/5/14/chartex" xmlns:mc="http://schemas.openxmlformats.org/markup-compatibility/2006" xmlns:aink="http://schemas.microsoft.com/office/drawing/2016/ink" xmlns:am3d="http://schemas.microsoft.com/office/drawing/2017/model3d" xmlns:o="urn:schemas-microsoft-com:office:office" xmlns:oel="http://schemas.microsoft.com/office/2019/extlst" xmlns:r="http://schemas.openxmlformats.org/officeDocument/2006/relationships" xmlns:m="http://schemas.openxmlformats.org/officeDocument/2006/math" xmlns:v="urn:schemas-microsoft-com:vml" xmlns:wp14="http://schemas.microsoft.com/office/word/2010/wordprocessingDrawing" xmlns:wp="http://schemas.openxmlformats.org/drawingml/2006/wordprocessingDrawing" xmlns:w10="urn:schemas-microsoft-com:office:word" xmlns:w="http://schemas.openxmlformats.org/wordprocessingml/2006/main" xmlns:w14="http://schemas.microsoft.com/office/word/2010/wordml" xmlns:w15="http://schemas.microsoft.com/office/word/2012/wordml" xmlns:w16cex="http://schemas.microsoft.com/office/word/2018/wordml/cex" xmlns:w16cid="http://schemas.microsoft.com/office/word/2016/wordml/cid" xmlns:w16="http://schemas.microsoft.com/office/word/2018/wordml" xmlns:w16du="http://schemas.microsoft.com/office/word/2023/wordml/word16du" xmlns:w16sdtdh="http://schemas.microsoft.com/office/word/2020/wordml/sdtdatahash" xmlns:w16sdtfl="http://schemas.microsoft.com/office/word/2024/wordml/sdtformatlock" xmlns:w16se="http://schemas.microsoft.com/office/word/2015/wordml/symex" xmlns:wpg="http://schemas.microsoft.com/office/word/2010/wordprocessingGroup" xmlns:wpi="http://schemas.microsoft.com/office/word/2010/wordprocessingInk" xmlns:wne="http://schemas.microsoft.com/office/word/2006/wordml" xmlns:wps="http://schemas.microsoft.com/office/word/2010/wordprocessingShape" mc:Ignorable="w14 w15 w16se w16cid w16 w16cex w16sdtdh w16sdtfl w16du wp14">
+  <w:endnote w:type="separator" w:id="-1">
+    <w:p>
+      <w:pPr>
+        <w:spacing w:after="0" w:line="240" w:lineRule="auto"/>
+      </w:pPr>
+      <w:r>
+        <w:separator/>
+      </w:r>
+    </w:p>
+  </w:endnote>
+  <w:endnote w:type="continuationSeparator" w:id="0">
+    <w:p>
+      <w:pPr>
+        <w:spacing w:after="0" w:line="240" w:lineRule="auto"/>
+      </w:pPr>
+      <w:r>
+        <w:continuationSeparator/>
+      </w:r>
+    </w:p>
+  </w:endnote>
+</w:endnotes>
+</file>
+
+<file path=word/footnotes.xml><?xml version="1.0" encoding="utf-8"?>
+<w:footnotes xmlns:wpc="http://schemas.microsoft.com/office/word/2010/wordprocessingCanvas" xmlns:cx="http://schemas.microsoft.com/office/drawing/2014/chartex" xmlns:cx1="http://schemas.microsoft.com/office/drawing/2015/9/8/chartex" xmlns:cx2="http://schemas.microsoft.com/office/drawing/2015/10/21/chartex" xmlns:cx3="http://schemas.microsoft.com/office/drawing/2016/5/9/chartex" xmlns:cx4="http://schemas.microsoft.com/office/drawing/2016/5/10/chartex" xmlns:cx5="http://schemas.microsoft.com/office/drawing/2016/5/11/chartex" xmlns:cx6="http://schemas.microsoft.com/office/drawing/2016/5/12/chartex" xmlns:cx7="http://schemas.microsoft.com/office/drawing/2016/5/13/chartex" xmlns:cx8="http://schemas.microsoft.com/office/drawing/2016/5/14/chartex" xmlns:mc="http://schemas.openxmlformats.org/markup-compatibility/2006" xmlns:aink="http://schemas.microsoft.com/office/drawing/2016/ink" xmlns:am3d="http://schemas.microsoft.com/office/drawing/2017/model3d" xmlns:o="urn:schemas-microsoft-com:office:office" xmlns:oel="http://schemas.microsoft.com/office/2019/extlst" xmlns:r="http://schemas.openxmlformats.org/officeDocument/2006/relationships" xmlns:m="http://schemas.openxmlformats.org/officeDocument/2006/math" xmlns:v="urn:schemas-microsoft-com:vml" xmlns:wp14="http://schemas.microsoft.com/office/word/2010/wordprocessingDrawing" xmlns:wp="http://schemas.openxmlformats.org/drawingml/2006/wordprocessingDrawing" xmlns:w10="urn:schemas-microsoft-com:office:word" xmlns:w="http://schemas.openxmlformats.org/wordprocessingml/2006/main" xmlns:w14="http://schemas.microsoft.com/office/word/2010/wordml" xmlns:w15="http://schemas.microsoft.com/office/word/2012/wordml" xmlns:w16cex="http://schemas.microsoft.com/office/word/2018/wordml/cex" xmlns:w16cid="http://schemas.microsoft.com/office/word/2016/wordml/cid" xmlns:w16="http://schemas.microsoft.com/office/word/2018/wordml" xmlns:w16du="http://schemas.microsoft.com/office/word/2023/wordml/word16du" xmlns:w16sdtdh="http://schemas.microsoft.com/office/word/2020/wordml/sdtdatahash" xmlns:w16sdtfl="http://schemas.microsoft.com/office/word/2024/wordml/sdtformatlock" xmlns:w16se="http://schemas.microsoft.com/office/word/2015/wordml/symex" xmlns:wpg="http://schemas.microsoft.com/office/word/2010/wordprocessingGroup" xmlns:wpi="http://schemas.microsoft.com/office/word/2010/wordprocessingInk" xmlns:wne="http://schemas.microsoft.com/office/word/2006/wordml" xmlns:wps="http://schemas.microsoft.com/office/word/2010/wordprocessingShape" mc:Ignorable="w14 w15 w16se w16cid w16 w16cex w16sdtdh w16sdtfl w16du wp14">
+  <w:footnote w:type="separator" w:id="-1">
+    <w:p>
+      <w:pPr>
+        <w:spacing w:after="0" w:line="240" w:lineRule="auto"/>
+      </w:pPr>
+      <w:r>
+        <w:separator/>
+      </w:r>
+    </w:p>
+  </w:footnote>
+  <w:footnote w:type="continuationSeparator" w:id="0">
+    <w:p>
+      <w:pPr>
+        <w:spacing w:after="0" w:line="240" w:lineRule="auto"/>
+      </w:pPr>
+      <w:r>
+        <w:continuationSeparator/>
+      </w:r>
+    </w:p>
+  </w:footnote>
+</w:footnotes>
 </file>
 
 <file path=word/numbering.xml><?xml version="1.0" encoding="utf-8"?>
@@ -948,8 +1162,97 @@
       </w:rPr>
     </w:lvl>
   </w:abstractNum>
+  <w:abstractNum w:abstractNumId="1" w15:restartNumberingAfterBreak="0">
+    <w:nsid w:val="5AAE06FF"/>
+    <w:multiLevelType w:val="hybridMultilevel"/>
+    <w:tmpl w:val="2DD4653E"/>
+    <w:lvl w:ilvl="0" w:tplc="04100011">
+      <w:start w:val="1"/>
+      <w:numFmt w:val="decimal"/>
+      <w:lvlText w:val="%1)"/>
+      <w:lvlJc w:val="left"/>
+      <w:pPr>
+        <w:ind w:left="720" w:hanging="360"/>
+      </w:pPr>
+    </w:lvl>
+    <w:lvl w:ilvl="1" w:tplc="04100019" w:tentative="1">
+      <w:start w:val="1"/>
+      <w:numFmt w:val="lowerLetter"/>
+      <w:lvlText w:val="%2."/>
+      <w:lvlJc w:val="left"/>
+      <w:pPr>
+        <w:ind w:left="1440" w:hanging="360"/>
+      </w:pPr>
+    </w:lvl>
+    <w:lvl w:ilvl="2" w:tplc="0410001B" w:tentative="1">
+      <w:start w:val="1"/>
+      <w:numFmt w:val="lowerRoman"/>
+      <w:lvlText w:val="%3."/>
+      <w:lvlJc w:val="right"/>
+      <w:pPr>
+        <w:ind w:left="2160" w:hanging="180"/>
+      </w:pPr>
+    </w:lvl>
+    <w:lvl w:ilvl="3" w:tplc="0410000F" w:tentative="1">
+      <w:start w:val="1"/>
+      <w:numFmt w:val="decimal"/>
+      <w:lvlText w:val="%4."/>
+      <w:lvlJc w:val="left"/>
+      <w:pPr>
+        <w:ind w:left="2880" w:hanging="360"/>
+      </w:pPr>
+    </w:lvl>
+    <w:lvl w:ilvl="4" w:tplc="04100019" w:tentative="1">
+      <w:start w:val="1"/>
+      <w:numFmt w:val="lowerLetter"/>
+      <w:lvlText w:val="%5."/>
+      <w:lvlJc w:val="left"/>
+      <w:pPr>
+        <w:ind w:left="3600" w:hanging="360"/>
+      </w:pPr>
+    </w:lvl>
+    <w:lvl w:ilvl="5" w:tplc="0410001B" w:tentative="1">
+      <w:start w:val="1"/>
+      <w:numFmt w:val="lowerRoman"/>
+      <w:lvlText w:val="%6."/>
+      <w:lvlJc w:val="right"/>
+      <w:pPr>
+        <w:ind w:left="4320" w:hanging="180"/>
+      </w:pPr>
+    </w:lvl>
+    <w:lvl w:ilvl="6" w:tplc="0410000F" w:tentative="1">
+      <w:start w:val="1"/>
+      <w:numFmt w:val="decimal"/>
+      <w:lvlText w:val="%7."/>
+      <w:lvlJc w:val="left"/>
+      <w:pPr>
+        <w:ind w:left="5040" w:hanging="360"/>
+      </w:pPr>
+    </w:lvl>
+    <w:lvl w:ilvl="7" w:tplc="04100019" w:tentative="1">
+      <w:start w:val="1"/>
+      <w:numFmt w:val="lowerLetter"/>
+      <w:lvlText w:val="%8."/>
+      <w:lvlJc w:val="left"/>
+      <w:pPr>
+        <w:ind w:left="5760" w:hanging="360"/>
+      </w:pPr>
+    </w:lvl>
+    <w:lvl w:ilvl="8" w:tplc="0410001B" w:tentative="1">
+      <w:start w:val="1"/>
+      <w:numFmt w:val="lowerRoman"/>
+      <w:lvlText w:val="%9."/>
+      <w:lvlJc w:val="right"/>
+      <w:pPr>
+        <w:ind w:left="6480" w:hanging="180"/>
+      </w:pPr>
+    </w:lvl>
+  </w:abstractNum>
   <w:num w:numId="1" w16cid:durableId="1605455987">
     <w:abstractNumId w:val="0"/>
+  </w:num>
+  <w:num w:numId="2" w16cid:durableId="44768096">
+    <w:abstractNumId w:val="1"/>
   </w:num>
 </w:numbering>
 </file>
@@ -1557,6 +1860,7 @@
   <w:style w:type="character" w:default="1" w:styleId="Carpredefinitoparagrafo">
     <w:name w:val="Default Paragraph Font"/>
     <w:uiPriority w:val="1"/>
+    <w:semiHidden/>
     <w:unhideWhenUsed/>
   </w:style>
   <w:style w:type="table" w:default="1" w:styleId="Tabellanormale">
@@ -1869,6 +2173,50 @@
       <w:color w:val="0F4761" w:themeColor="accent1" w:themeShade="BF"/>
       <w:spacing w:val="5"/>
     </w:rPr>
+  </w:style>
+  <w:style w:type="paragraph" w:styleId="Intestazione">
+    <w:name w:val="header"/>
+    <w:basedOn w:val="Normale"/>
+    <w:link w:val="IntestazioneCarattere"/>
+    <w:uiPriority w:val="99"/>
+    <w:unhideWhenUsed/>
+    <w:rsid w:val="007A0553"/>
+    <w:pPr>
+      <w:tabs>
+        <w:tab w:val="center" w:pos="4819"/>
+        <w:tab w:val="right" w:pos="9638"/>
+      </w:tabs>
+      <w:spacing w:after="0" w:line="240" w:lineRule="auto"/>
+    </w:pPr>
+  </w:style>
+  <w:style w:type="character" w:customStyle="1" w:styleId="IntestazioneCarattere">
+    <w:name w:val="Intestazione Carattere"/>
+    <w:basedOn w:val="Carpredefinitoparagrafo"/>
+    <w:link w:val="Intestazione"/>
+    <w:uiPriority w:val="99"/>
+    <w:rsid w:val="007A0553"/>
+  </w:style>
+  <w:style w:type="paragraph" w:styleId="Pidipagina">
+    <w:name w:val="footer"/>
+    <w:basedOn w:val="Normale"/>
+    <w:link w:val="PidipaginaCarattere"/>
+    <w:uiPriority w:val="99"/>
+    <w:unhideWhenUsed/>
+    <w:rsid w:val="007A0553"/>
+    <w:pPr>
+      <w:tabs>
+        <w:tab w:val="center" w:pos="4819"/>
+        <w:tab w:val="right" w:pos="9638"/>
+      </w:tabs>
+      <w:spacing w:after="0" w:line="240" w:lineRule="auto"/>
+    </w:pPr>
+  </w:style>
+  <w:style w:type="character" w:customStyle="1" w:styleId="PidipaginaCarattere">
+    <w:name w:val="Piè di pagina Carattere"/>
+    <w:basedOn w:val="Carpredefinitoparagrafo"/>
+    <w:link w:val="Pidipagina"/>
+    <w:uiPriority w:val="99"/>
+    <w:rsid w:val="007A0553"/>
   </w:style>
 </w:styles>
 </file>

</xml_diff>